<commit_message>
Soften the Einstein passage: 'alternative ontological viewpoint' instead of 'misinterpreted' (EN/ZH introductions)
</commit_message>
<xml_diff>
--- a/docs/From Change to Everything - Plain Introduction.docx
+++ b/docs/From Change to Everything - Plain Introduction.docx
@@ -1201,7 +1201,7 @@
           <w:rFonts w:ascii="Calibri" w:hAnsi="Calibri" w:eastAsia="Calibri"/>
           <w:sz w:val="22"/>
         </w:rPr>
-        <w:t xml:space="preserve">He merely </w:t>
+        <w:t xml:space="preserve">If we adopt a different ontological viewpoint, the physical picture behind the equations can be another one: </w:t>
       </w:r>
       <w:r>
         <w:rPr>
@@ -1209,14 +1209,29 @@
           <w:b/>
           <w:sz w:val="22"/>
         </w:rPr>
-        <w:t>misinterpreted it</w:t>
-      </w:r>
-      <w:r>
-        <w:rPr>
-          <w:rFonts w:ascii="Calibri" w:hAnsi="Calibri" w:eastAsia="Calibri"/>
-          <w:sz w:val="22"/>
-        </w:rPr>
-        <w:t>: he mistook "the curvature of vacuum fluctuations" for "the curvature of spacetime." The equations are right — the phenomena they describe and the predictions they make are correct; but the ontology behind the equations — "there is a thing called spacetime, and it is being bent" — is wrong.</w:t>
+        <w:t>what curves is, in fact, the vacuum fluctuation.</w:t>
+      </w:r>
+      <w:r>
+        <w:rPr>
+          <w:rFonts w:ascii="Calibri" w:hAnsi="Calibri" w:eastAsia="Calibri"/>
+          <w:sz w:val="22"/>
+        </w:rPr>
+        <w:t xml:space="preserve"> This is not to say relativity no longer works — the phenomena the equations describe and the predictions they make all still stand; rather, we gain a new understanding of the </w:t>
+      </w:r>
+      <w:r>
+        <w:rPr>
+          <w:rFonts w:ascii="Calibri" w:hAnsi="Calibri" w:eastAsia="Calibri"/>
+          <w:i/>
+          <w:sz w:val="22"/>
+        </w:rPr>
+        <w:t>root</w:t>
+      </w:r>
+      <w:r>
+        <w:rPr>
+          <w:rFonts w:ascii="Calibri" w:hAnsi="Calibri" w:eastAsia="Calibri"/>
+          <w:sz w:val="22"/>
+        </w:rPr>
+        <w:t xml:space="preserve"> of "curvature": what really "curves" is the spectral structure of the vacuum fluctuations, not the entity called "spacetime."</w:t>
       </w:r>
     </w:p>
     <w:p>
@@ -1228,7 +1243,7 @@
           <w:rFonts w:ascii="Calibri" w:hAnsi="Calibri" w:eastAsia="Calibri"/>
           <w:sz w:val="22"/>
         </w:rPr>
-        <w:t>An analogy: you see a whirlpool on a river and say "the riverbed must be dented here." But the riverbed does not exist; what actually changes is the water itself. Einstein's equations precisely describe the "whirlpool," yet attribute it to a "dented riverbed" — and the attribution is wrong. What really "curves" and "changes" is the water (vacuum fluctuations), not the riverbed (spacetime).</w:t>
+        <w:t>An analogy: you see a whirlpool on a river and say "the riverbed must be dented here." One can also look at it another way: the riverbed does not exist at all; what actually changes is the water itself. Einstein's equations precisely describe the "whirlpool," simply attributing it to a "dented riverbed"; and we may attribute it differently — what really "curves" and "changes" is the water (vacuum fluctuations), not the riverbed (spacetime).</w:t>
       </w:r>
     </w:p>
     <w:p>

</xml_diff>